<commit_message>
New chapter from Green.
</commit_message>
<xml_diff>
--- a/chapters/green.docx
+++ b/chapters/green.docx
@@ -6,8 +6,6 @@
       <w:pPr>
         <w:rPr>
           <w:rFonts w:ascii="Times New Roman" w:hAnsi="Times New Roman" w:cs="Times New Roman"/>
-          <w:i/>
-          <w:iCs/>
           <w:sz w:val="32"/>
           <w:szCs w:val="32"/>
         </w:rPr>
@@ -122,24 +120,6 @@
       </w:r>
     </w:p>
     <w:bookmarkEnd w:id="0"/>
-    <w:p>
-      <w:pPr>
-        <w:rPr>
-          <w:rFonts w:ascii="Times New Roman" w:hAnsi="Times New Roman" w:cs="Times New Roman"/>
-          <w:sz w:val="24"/>
-          <w:szCs w:val="24"/>
-        </w:rPr>
-      </w:pPr>
-    </w:p>
-    <w:p>
-      <w:pPr>
-        <w:rPr>
-          <w:rFonts w:ascii="Times New Roman" w:hAnsi="Times New Roman" w:cs="Times New Roman"/>
-          <w:sz w:val="24"/>
-          <w:szCs w:val="24"/>
-        </w:rPr>
-      </w:pPr>
-    </w:p>
     <w:p>
       <w:pPr>
         <w:rPr>
@@ -182,7 +162,23 @@
           <w:sz w:val="24"/>
           <w:szCs w:val="24"/>
         </w:rPr>
-        <w:t>. Heidegger’s account of state authority is subject</w:t>
+        <w:t xml:space="preserve">. Heidegger’s account of state authority is </w:t>
+      </w:r>
+      <w:r>
+        <w:rPr>
+          <w:rFonts w:ascii="Times New Roman" w:hAnsi="Times New Roman" w:cs="Times New Roman"/>
+          <w:sz w:val="24"/>
+          <w:szCs w:val="24"/>
+        </w:rPr>
+        <w:t xml:space="preserve">a </w:t>
+      </w:r>
+      <w:r>
+        <w:rPr>
+          <w:rFonts w:ascii="Times New Roman" w:hAnsi="Times New Roman" w:cs="Times New Roman"/>
+          <w:sz w:val="24"/>
+          <w:szCs w:val="24"/>
+        </w:rPr>
+        <w:t>subject</w:t>
       </w:r>
       <w:r>
         <w:rPr>
@@ -506,7 +502,23 @@
           <w:sz w:val="24"/>
           <w:szCs w:val="24"/>
         </w:rPr>
-        <w:t xml:space="preserve"> modern politics, he does this to have an alternative mode of government authority that is not predicated on a</w:t>
+        <w:t xml:space="preserve"> modern politics, he does </w:t>
+      </w:r>
+      <w:r>
+        <w:rPr>
+          <w:rFonts w:ascii="Times New Roman" w:hAnsi="Times New Roman" w:cs="Times New Roman"/>
+          <w:sz w:val="24"/>
+          <w:szCs w:val="24"/>
+        </w:rPr>
+        <w:t>so</w:t>
+      </w:r>
+      <w:r>
+        <w:rPr>
+          <w:rFonts w:ascii="Times New Roman" w:hAnsi="Times New Roman" w:cs="Times New Roman"/>
+          <w:sz w:val="24"/>
+          <w:szCs w:val="24"/>
+        </w:rPr>
+        <w:t xml:space="preserve"> to have an alternative mode of government authority that is not predicated on a</w:t>
       </w:r>
       <w:r>
         <w:rPr>
@@ -2174,25 +2186,7 @@
           <w:sz w:val="24"/>
           <w:szCs w:val="24"/>
         </w:rPr>
-        <w:t xml:space="preserve">sessions from November 3, </w:t>
-      </w:r>
-      <w:proofErr w:type="gramStart"/>
-      <w:r>
-        <w:rPr>
-          <w:rFonts w:ascii="Times New Roman" w:hAnsi="Times New Roman" w:cs="Times New Roman"/>
-          <w:sz w:val="24"/>
-          <w:szCs w:val="24"/>
-        </w:rPr>
-        <w:t>1933</w:t>
-      </w:r>
-      <w:proofErr w:type="gramEnd"/>
-      <w:r>
-        <w:rPr>
-          <w:rFonts w:ascii="Times New Roman" w:hAnsi="Times New Roman" w:cs="Times New Roman"/>
-          <w:sz w:val="24"/>
-          <w:szCs w:val="24"/>
-        </w:rPr>
-        <w:t xml:space="preserve"> to February </w:t>
+        <w:t xml:space="preserve">sessions from November 3, 1933 to February </w:t>
       </w:r>
       <w:r>
         <w:rPr>
@@ -2208,25 +2202,7 @@
           <w:sz w:val="24"/>
           <w:szCs w:val="24"/>
         </w:rPr>
-        <w:t xml:space="preserve">This </w:t>
-      </w:r>
-      <w:proofErr w:type="gramStart"/>
-      <w:r>
-        <w:rPr>
-          <w:rFonts w:ascii="Times New Roman" w:hAnsi="Times New Roman" w:cs="Times New Roman"/>
-          <w:sz w:val="24"/>
-          <w:szCs w:val="24"/>
-        </w:rPr>
-        <w:t>time period</w:t>
-      </w:r>
-      <w:proofErr w:type="gramEnd"/>
-      <w:r>
-        <w:rPr>
-          <w:rFonts w:ascii="Times New Roman" w:hAnsi="Times New Roman" w:cs="Times New Roman"/>
-          <w:sz w:val="24"/>
-          <w:szCs w:val="24"/>
-        </w:rPr>
-        <w:t xml:space="preserve"> </w:t>
+        <w:t xml:space="preserve">This time period </w:t>
       </w:r>
       <w:r>
         <w:rPr>
@@ -5427,51 +5403,7 @@
           <w:szCs w:val="24"/>
           <w14:ligatures w14:val="none"/>
         </w:rPr>
-        <w:t xml:space="preserve">, Heidegger says, is what is unconcealed, and </w:t>
-      </w:r>
-      <w:proofErr w:type="spellStart"/>
-      <w:r>
-        <w:rPr>
-          <w:rFonts w:ascii="Times New Roman" w:hAnsi="Times New Roman" w:cs="Times New Roman"/>
-          <w:kern w:val="0"/>
-          <w:sz w:val="24"/>
-          <w:szCs w:val="24"/>
-          <w14:ligatures w14:val="none"/>
-        </w:rPr>
-        <w:t>unconcealment</w:t>
-      </w:r>
-      <w:proofErr w:type="spellEnd"/>
-      <w:r>
-        <w:rPr>
-          <w:rFonts w:ascii="Times New Roman" w:hAnsi="Times New Roman" w:cs="Times New Roman"/>
-          <w:kern w:val="0"/>
-          <w:sz w:val="24"/>
-          <w:szCs w:val="24"/>
-          <w14:ligatures w14:val="none"/>
-        </w:rPr>
-        <w:t xml:space="preserve"> is not predicated upon a “</w:t>
-      </w:r>
-      <w:proofErr w:type="gramStart"/>
-      <w:r>
-        <w:rPr>
-          <w:rFonts w:ascii="Times New Roman" w:hAnsi="Times New Roman" w:cs="Times New Roman"/>
-          <w:kern w:val="0"/>
-          <w:sz w:val="24"/>
-          <w:szCs w:val="24"/>
-          <w14:ligatures w14:val="none"/>
-        </w:rPr>
-        <w:t>making-sense</w:t>
-      </w:r>
-      <w:proofErr w:type="gramEnd"/>
-      <w:r>
-        <w:rPr>
-          <w:rFonts w:ascii="Times New Roman" w:hAnsi="Times New Roman" w:cs="Times New Roman"/>
-          <w:kern w:val="0"/>
-          <w:sz w:val="24"/>
-          <w:szCs w:val="24"/>
-          <w14:ligatures w14:val="none"/>
-        </w:rPr>
-        <w:t xml:space="preserve">” of the </w:t>
+        <w:t xml:space="preserve">, Heidegger says, is what is unconcealed, and unconcealment is not predicated upon a “making-sense” of the </w:t>
       </w:r>
       <w:r>
         <w:rPr>
@@ -5648,29 +5580,7 @@
           <w:szCs w:val="24"/>
           <w14:ligatures w14:val="none"/>
         </w:rPr>
-        <w:t xml:space="preserve"> Thus, </w:t>
-      </w:r>
-      <w:proofErr w:type="gramStart"/>
-      <w:r>
-        <w:rPr>
-          <w:rFonts w:ascii="Times New Roman" w:hAnsi="Times New Roman" w:cs="Times New Roman"/>
-          <w:kern w:val="0"/>
-          <w:sz w:val="24"/>
-          <w:szCs w:val="24"/>
-          <w14:ligatures w14:val="none"/>
-        </w:rPr>
-        <w:t>Being</w:t>
-      </w:r>
-      <w:proofErr w:type="gramEnd"/>
-      <w:r>
-        <w:rPr>
-          <w:rFonts w:ascii="Times New Roman" w:hAnsi="Times New Roman" w:cs="Times New Roman"/>
-          <w:kern w:val="0"/>
-          <w:sz w:val="24"/>
-          <w:szCs w:val="24"/>
-          <w14:ligatures w14:val="none"/>
-        </w:rPr>
-        <w:t xml:space="preserve"> is the issue for which human beings are concerned</w:t>
+        <w:t xml:space="preserve"> Thus, Being is the issue for which human beings are concerned</w:t>
       </w:r>
       <w:r>
         <w:rPr>
@@ -6330,42 +6240,18 @@
           <w:szCs w:val="24"/>
           <w14:ligatures w14:val="none"/>
         </w:rPr>
-        <w:t xml:space="preserve"> relationship with </w:t>
-      </w:r>
-      <w:proofErr w:type="gramStart"/>
-      <w:r>
-        <w:rPr>
-          <w:rFonts w:ascii="Times New Roman" w:hAnsi="Times New Roman" w:cs="Times New Roman"/>
-          <w:iCs/>
-          <w:kern w:val="0"/>
-          <w:sz w:val="24"/>
-          <w:szCs w:val="24"/>
-          <w14:ligatures w14:val="none"/>
-        </w:rPr>
-        <w:t>Being</w:t>
-      </w:r>
-      <w:r>
-        <w:rPr>
-          <w:rFonts w:ascii="Times New Roman" w:hAnsi="Times New Roman" w:cs="Times New Roman"/>
-          <w:iCs/>
-          <w:kern w:val="0"/>
-          <w:sz w:val="24"/>
-          <w:szCs w:val="24"/>
-          <w14:ligatures w14:val="none"/>
-        </w:rPr>
-        <w:t xml:space="preserve"> cannot be</w:t>
-      </w:r>
-      <w:proofErr w:type="gramEnd"/>
-      <w:r>
-        <w:rPr>
-          <w:rFonts w:ascii="Times New Roman" w:hAnsi="Times New Roman" w:cs="Times New Roman"/>
-          <w:iCs/>
-          <w:kern w:val="0"/>
-          <w:sz w:val="24"/>
-          <w:szCs w:val="24"/>
-          <w14:ligatures w14:val="none"/>
-        </w:rPr>
-        <w:t xml:space="preserve"> a separate inquiry from </w:t>
+        <w:t xml:space="preserve"> relationship with Being</w:t>
+      </w:r>
+      <w:r>
+        <w:rPr>
+          <w:rFonts w:ascii="Times New Roman" w:hAnsi="Times New Roman" w:cs="Times New Roman"/>
+          <w:iCs/>
+          <w:kern w:val="0"/>
+          <w:sz w:val="24"/>
+          <w:szCs w:val="24"/>
+          <w14:ligatures w14:val="none"/>
+        </w:rPr>
+        <w:t xml:space="preserve"> cannot be a separate inquiry from </w:t>
       </w:r>
       <w:r>
         <w:rPr>
@@ -7779,19 +7665,7 @@
           <w:szCs w:val="24"/>
           <w14:ligatures w14:val="none"/>
         </w:rPr>
-        <w:t xml:space="preserve"> </w:t>
-      </w:r>
-      <w:proofErr w:type="gramStart"/>
-      <w:r>
-        <w:rPr>
-          <w:rFonts w:ascii="Times New Roman" w:hAnsi="Times New Roman" w:cs="Times New Roman"/>
-          <w:iCs/>
-          <w:kern w:val="0"/>
-          <w:sz w:val="24"/>
-          <w:szCs w:val="24"/>
-          <w14:ligatures w14:val="none"/>
-        </w:rPr>
-        <w:t xml:space="preserve">particular </w:t>
+        <w:t xml:space="preserve"> particular </w:t>
       </w:r>
       <w:r>
         <w:rPr>
@@ -7813,19 +7687,7 @@
           <w:szCs w:val="24"/>
           <w14:ligatures w14:val="none"/>
         </w:rPr>
-        <w:t>al</w:t>
-      </w:r>
-      <w:proofErr w:type="gramEnd"/>
-      <w:r>
-        <w:rPr>
-          <w:rFonts w:ascii="Times New Roman" w:hAnsi="Times New Roman" w:cs="Times New Roman"/>
-          <w:iCs/>
-          <w:kern w:val="0"/>
-          <w:sz w:val="24"/>
-          <w:szCs w:val="24"/>
-          <w14:ligatures w14:val="none"/>
-        </w:rPr>
-        <w:t xml:space="preserve"> existence</w:t>
+        <w:t>al existence</w:t>
       </w:r>
       <w:r>
         <w:rPr>
@@ -8268,21 +8130,8 @@
           <w:szCs w:val="24"/>
           <w14:ligatures w14:val="none"/>
         </w:rPr>
-        <w:t xml:space="preserve"> degeneration of individual will </w:t>
-      </w:r>
-      <w:proofErr w:type="gramStart"/>
-      <w:r>
-        <w:rPr>
-          <w:rFonts w:ascii="Times New Roman" w:hAnsi="Times New Roman" w:cs="Times New Roman"/>
-          <w:iCs/>
-          <w:kern w:val="0"/>
-          <w:sz w:val="24"/>
-          <w:szCs w:val="24"/>
-          <w14:ligatures w14:val="none"/>
-        </w:rPr>
-        <w:t>is</w:t>
-      </w:r>
-      <w:proofErr w:type="gramEnd"/>
+        <w:t xml:space="preserve"> degeneration of individual will is</w:t>
+      </w:r>
       <w:r>
         <w:rPr>
           <w:rFonts w:ascii="Times New Roman" w:hAnsi="Times New Roman" w:cs="Times New Roman"/>
@@ -8417,21 +8266,8 @@
           <w:szCs w:val="24"/>
           <w14:ligatures w14:val="none"/>
         </w:rPr>
-        <w:t xml:space="preserve">status rei </w:t>
-      </w:r>
-      <w:proofErr w:type="spellStart"/>
-      <w:r>
-        <w:rPr>
-          <w:rFonts w:ascii="Times New Roman" w:hAnsi="Times New Roman" w:cs="Times New Roman"/>
-          <w:i/>
-          <w:kern w:val="0"/>
-          <w:sz w:val="24"/>
-          <w:szCs w:val="24"/>
-          <w14:ligatures w14:val="none"/>
-        </w:rPr>
-        <w:t>publicae</w:t>
-      </w:r>
-      <w:proofErr w:type="spellEnd"/>
+        <w:t>status rei publicae</w:t>
+      </w:r>
       <w:r>
         <w:rPr>
           <w:rFonts w:ascii="Times New Roman" w:hAnsi="Times New Roman" w:cs="Times New Roman"/>
@@ -9316,31 +9152,7 @@
           <w:szCs w:val="24"/>
           <w14:ligatures w14:val="none"/>
         </w:rPr>
-        <w:t xml:space="preserve"> own context, the </w:t>
-      </w:r>
-      <w:proofErr w:type="gramStart"/>
-      <w:r>
-        <w:rPr>
-          <w:rFonts w:ascii="Times New Roman" w:hAnsi="Times New Roman" w:cs="Times New Roman"/>
-          <w:iCs/>
-          <w:kern w:val="0"/>
-          <w:sz w:val="24"/>
-          <w:szCs w:val="24"/>
-          <w14:ligatures w14:val="none"/>
-        </w:rPr>
-        <w:t>time period</w:t>
-      </w:r>
-      <w:proofErr w:type="gramEnd"/>
-      <w:r>
-        <w:rPr>
-          <w:rFonts w:ascii="Times New Roman" w:hAnsi="Times New Roman" w:cs="Times New Roman"/>
-          <w:iCs/>
-          <w:kern w:val="0"/>
-          <w:sz w:val="24"/>
-          <w:szCs w:val="24"/>
-          <w14:ligatures w14:val="none"/>
-        </w:rPr>
-        <w:t xml:space="preserve"> of the fall of the Weimar Republic</w:t>
+        <w:t xml:space="preserve"> own context, the time period of the fall of the Weimar Republic</w:t>
       </w:r>
       <w:r>
         <w:rPr>
@@ -9845,42 +9657,18 @@
           <w:szCs w:val="24"/>
           <w14:ligatures w14:val="none"/>
         </w:rPr>
-        <w:t xml:space="preserve">Considering the </w:t>
-      </w:r>
-      <w:proofErr w:type="gramStart"/>
-      <w:r>
-        <w:rPr>
-          <w:rFonts w:ascii="Times New Roman" w:hAnsi="Times New Roman" w:cs="Times New Roman"/>
-          <w:iCs/>
-          <w:kern w:val="0"/>
-          <w:sz w:val="24"/>
-          <w:szCs w:val="24"/>
-          <w14:ligatures w14:val="none"/>
-        </w:rPr>
-        <w:t xml:space="preserve">time </w:t>
-      </w:r>
-      <w:r>
-        <w:rPr>
-          <w:rFonts w:ascii="Times New Roman" w:hAnsi="Times New Roman" w:cs="Times New Roman"/>
-          <w:iCs/>
-          <w:kern w:val="0"/>
-          <w:sz w:val="24"/>
-          <w:szCs w:val="24"/>
-          <w14:ligatures w14:val="none"/>
-        </w:rPr>
-        <w:t>period</w:t>
-      </w:r>
-      <w:proofErr w:type="gramEnd"/>
-      <w:r>
-        <w:rPr>
-          <w:rFonts w:ascii="Times New Roman" w:hAnsi="Times New Roman" w:cs="Times New Roman"/>
-          <w:iCs/>
-          <w:kern w:val="0"/>
-          <w:sz w:val="24"/>
-          <w:szCs w:val="24"/>
-          <w14:ligatures w14:val="none"/>
-        </w:rPr>
-        <w:t xml:space="preserve"> </w:t>
+        <w:t xml:space="preserve">Considering the time </w:t>
+      </w:r>
+      <w:r>
+        <w:rPr>
+          <w:rFonts w:ascii="Times New Roman" w:hAnsi="Times New Roman" w:cs="Times New Roman"/>
+          <w:iCs/>
+          <w:kern w:val="0"/>
+          <w:sz w:val="24"/>
+          <w:szCs w:val="24"/>
+          <w14:ligatures w14:val="none"/>
+        </w:rPr>
+        <w:t xml:space="preserve">period </w:t>
       </w:r>
       <w:r>
         <w:rPr>
@@ -10765,42 +10553,18 @@
           <w:szCs w:val="24"/>
           <w14:ligatures w14:val="none"/>
         </w:rPr>
-        <w:t xml:space="preserve">. </w:t>
-      </w:r>
-      <w:proofErr w:type="gramStart"/>
-      <w:r>
-        <w:rPr>
-          <w:rFonts w:ascii="Times New Roman" w:hAnsi="Times New Roman" w:cs="Times New Roman"/>
-          <w:iCs/>
-          <w:kern w:val="0"/>
-          <w:sz w:val="24"/>
-          <w:szCs w:val="24"/>
-          <w14:ligatures w14:val="none"/>
-        </w:rPr>
-        <w:t>I</w:t>
-      </w:r>
-      <w:r>
-        <w:rPr>
-          <w:rFonts w:ascii="Times New Roman" w:hAnsi="Times New Roman" w:cs="Times New Roman"/>
-          <w:iCs/>
-          <w:kern w:val="0"/>
-          <w:sz w:val="24"/>
-          <w:szCs w:val="24"/>
-          <w14:ligatures w14:val="none"/>
-        </w:rPr>
-        <w:t>n order to</w:t>
-      </w:r>
-      <w:proofErr w:type="gramEnd"/>
-      <w:r>
-        <w:rPr>
-          <w:rFonts w:ascii="Times New Roman" w:hAnsi="Times New Roman" w:cs="Times New Roman"/>
-          <w:iCs/>
-          <w:kern w:val="0"/>
-          <w:sz w:val="24"/>
-          <w:szCs w:val="24"/>
-          <w14:ligatures w14:val="none"/>
-        </w:rPr>
-        <w:t xml:space="preserve"> justify the historical destiny of the people</w:t>
+        <w:t>. I</w:t>
+      </w:r>
+      <w:r>
+        <w:rPr>
+          <w:rFonts w:ascii="Times New Roman" w:hAnsi="Times New Roman" w:cs="Times New Roman"/>
+          <w:iCs/>
+          <w:kern w:val="0"/>
+          <w:sz w:val="24"/>
+          <w:szCs w:val="24"/>
+          <w14:ligatures w14:val="none"/>
+        </w:rPr>
+        <w:t>n order to justify the historical destiny of the people</w:t>
       </w:r>
       <w:r>
         <w:rPr>
@@ -11291,7 +11055,6 @@
         </w:rPr>
         <w:t xml:space="preserve">, Heidegger proposes the fundamental friction of Greek </w:t>
       </w:r>
-      <w:proofErr w:type="spellStart"/>
       <w:r>
         <w:rPr>
           <w:rFonts w:ascii="Times New Roman" w:hAnsi="Times New Roman" w:cs="Times New Roman"/>
@@ -11303,7 +11066,6 @@
         </w:rPr>
         <w:t>polemos</w:t>
       </w:r>
-      <w:proofErr w:type="spellEnd"/>
       <w:r>
         <w:rPr>
           <w:rFonts w:ascii="Times New Roman" w:hAnsi="Times New Roman" w:cs="Times New Roman"/>
@@ -11548,31 +11310,7 @@
           <w:szCs w:val="24"/>
           <w14:ligatures w14:val="none"/>
         </w:rPr>
-        <w:t xml:space="preserve">, </w:t>
-      </w:r>
-      <w:proofErr w:type="gramStart"/>
-      <w:r>
-        <w:rPr>
-          <w:rFonts w:ascii="Times New Roman" w:hAnsi="Times New Roman" w:cs="Times New Roman"/>
-          <w:iCs/>
-          <w:kern w:val="0"/>
-          <w:sz w:val="24"/>
-          <w:szCs w:val="24"/>
-          <w14:ligatures w14:val="none"/>
-        </w:rPr>
-        <w:t>Being</w:t>
-      </w:r>
-      <w:proofErr w:type="gramEnd"/>
-      <w:r>
-        <w:rPr>
-          <w:rFonts w:ascii="Times New Roman" w:hAnsi="Times New Roman" w:cs="Times New Roman"/>
-          <w:iCs/>
-          <w:kern w:val="0"/>
-          <w:sz w:val="24"/>
-          <w:szCs w:val="24"/>
-          <w14:ligatures w14:val="none"/>
-        </w:rPr>
-        <w:t xml:space="preserve"> is not given</w:t>
+        <w:t>, Being is not given</w:t>
       </w:r>
       <w:r>
         <w:rPr>
@@ -12279,31 +12017,7 @@
           <w:szCs w:val="24"/>
           <w14:ligatures w14:val="none"/>
         </w:rPr>
-        <w:t xml:space="preserve"> a </w:t>
-      </w:r>
-      <w:proofErr w:type="gramStart"/>
-      <w:r>
-        <w:rPr>
-          <w:rFonts w:ascii="Times New Roman" w:hAnsi="Times New Roman" w:cs="Times New Roman"/>
-          <w:iCs/>
-          <w:kern w:val="0"/>
-          <w:sz w:val="24"/>
-          <w:szCs w:val="24"/>
-          <w14:ligatures w14:val="none"/>
-        </w:rPr>
-        <w:t>peoples</w:t>
-      </w:r>
-      <w:proofErr w:type="gramEnd"/>
-      <w:r>
-        <w:rPr>
-          <w:rFonts w:ascii="Times New Roman" w:hAnsi="Times New Roman" w:cs="Times New Roman"/>
-          <w:iCs/>
-          <w:kern w:val="0"/>
-          <w:sz w:val="24"/>
-          <w:szCs w:val="24"/>
-          <w14:ligatures w14:val="none"/>
-        </w:rPr>
-        <w:t xml:space="preserve"> t</w:t>
+        <w:t xml:space="preserve"> a peoples t</w:t>
       </w:r>
       <w:r>
         <w:rPr>
@@ -12846,31 +12560,7 @@
           <w:szCs w:val="24"/>
           <w14:ligatures w14:val="none"/>
         </w:rPr>
-        <w:t xml:space="preserve">idea does true order arise…Then the existence and superiority of the leader sinks into Being, the soul of the people, and binds it in this way with originality and passion to the task. And if the people </w:t>
-      </w:r>
-      <w:proofErr w:type="gramStart"/>
-      <w:r>
-        <w:rPr>
-          <w:rFonts w:ascii="Times New Roman" w:hAnsi="Times New Roman" w:cs="Times New Roman"/>
-          <w:iCs/>
-          <w:kern w:val="0"/>
-          <w:sz w:val="24"/>
-          <w:szCs w:val="24"/>
-          <w14:ligatures w14:val="none"/>
-        </w:rPr>
-        <w:t>feels</w:t>
-      </w:r>
-      <w:proofErr w:type="gramEnd"/>
-      <w:r>
-        <w:rPr>
-          <w:rFonts w:ascii="Times New Roman" w:hAnsi="Times New Roman" w:cs="Times New Roman"/>
-          <w:iCs/>
-          <w:kern w:val="0"/>
-          <w:sz w:val="24"/>
-          <w:szCs w:val="24"/>
-          <w14:ligatures w14:val="none"/>
-        </w:rPr>
-        <w:t xml:space="preserve"> this dedication, it will let itself be led into struggle, and it will love struggle and will it.”</w:t>
+        <w:t>idea does true order arise…Then the existence and superiority of the leader sinks into Being, the soul of the people, and binds it in this way with originality and passion to the task. And if the people feels this dedication, it will let itself be led into struggle, and it will love struggle and will it.”</w:t>
       </w:r>
       <w:r>
         <w:rPr>
@@ -13519,31 +13209,7 @@
           <w:szCs w:val="24"/>
           <w14:ligatures w14:val="none"/>
         </w:rPr>
-        <w:t xml:space="preserve">or detachment from the world. It is in this period where Heidegger writes about the </w:t>
-      </w:r>
-      <w:proofErr w:type="spellStart"/>
-      <w:r>
-        <w:rPr>
-          <w:rFonts w:ascii="Times New Roman" w:hAnsi="Times New Roman" w:cs="Times New Roman"/>
-          <w:iCs/>
-          <w:kern w:val="0"/>
-          <w:sz w:val="24"/>
-          <w:szCs w:val="24"/>
-          <w14:ligatures w14:val="none"/>
-        </w:rPr>
-        <w:t>Enframed</w:t>
-      </w:r>
-      <w:proofErr w:type="spellEnd"/>
-      <w:r>
-        <w:rPr>
-          <w:rFonts w:ascii="Times New Roman" w:hAnsi="Times New Roman" w:cs="Times New Roman"/>
-          <w:iCs/>
-          <w:kern w:val="0"/>
-          <w:sz w:val="24"/>
-          <w:szCs w:val="24"/>
-          <w14:ligatures w14:val="none"/>
-        </w:rPr>
-        <w:t xml:space="preserve"> world of technological globalization. In one sense, Heidegger turns away from the affairs of the state, to </w:t>
+        <w:t xml:space="preserve">or detachment from the world. It is in this period where Heidegger writes about the Enframed world of technological globalization. In one sense, Heidegger turns away from the affairs of the state, to </w:t>
       </w:r>
       <w:r>
         <w:rPr>
@@ -13635,31 +13301,7 @@
           <w14:ligatures w14:val="none"/>
         </w:rPr>
         <w:tab/>
-        <w:t xml:space="preserve">Nevertheless, having </w:t>
-      </w:r>
-      <w:proofErr w:type="gramStart"/>
-      <w:r>
-        <w:rPr>
-          <w:rFonts w:ascii="Times New Roman" w:hAnsi="Times New Roman" w:cs="Times New Roman"/>
-          <w:iCs/>
-          <w:kern w:val="0"/>
-          <w:sz w:val="24"/>
-          <w:szCs w:val="24"/>
-          <w14:ligatures w14:val="none"/>
-        </w:rPr>
-        <w:t>Being</w:t>
-      </w:r>
-      <w:proofErr w:type="gramEnd"/>
-      <w:r>
-        <w:rPr>
-          <w:rFonts w:ascii="Times New Roman" w:hAnsi="Times New Roman" w:cs="Times New Roman"/>
-          <w:iCs/>
-          <w:kern w:val="0"/>
-          <w:sz w:val="24"/>
-          <w:szCs w:val="24"/>
-          <w14:ligatures w14:val="none"/>
-        </w:rPr>
-        <w:t xml:space="preserve"> as </w:t>
+        <w:t xml:space="preserve">Nevertheless, having Being as </w:t>
       </w:r>
       <w:r>
         <w:rPr>
@@ -14907,31 +14549,7 @@
           <w:szCs w:val="24"/>
           <w14:ligatures w14:val="none"/>
         </w:rPr>
-        <w:t xml:space="preserve">a state legitimized by a status of </w:t>
-      </w:r>
-      <w:proofErr w:type="gramStart"/>
-      <w:r>
-        <w:rPr>
-          <w:rFonts w:ascii="Times New Roman" w:hAnsi="Times New Roman" w:cs="Times New Roman"/>
-          <w:iCs/>
-          <w:kern w:val="0"/>
-          <w:sz w:val="24"/>
-          <w:szCs w:val="24"/>
-          <w14:ligatures w14:val="none"/>
-        </w:rPr>
-        <w:t>Being must be</w:t>
-      </w:r>
-      <w:proofErr w:type="gramEnd"/>
-      <w:r>
-        <w:rPr>
-          <w:rFonts w:ascii="Times New Roman" w:hAnsi="Times New Roman" w:cs="Times New Roman"/>
-          <w:iCs/>
-          <w:kern w:val="0"/>
-          <w:sz w:val="24"/>
-          <w:szCs w:val="24"/>
-          <w14:ligatures w14:val="none"/>
-        </w:rPr>
-        <w:t xml:space="preserve"> met with skepticism</w:t>
+        <w:t>a state legitimized by a status of Being must be met with skepticism</w:t>
       </w:r>
       <w:r>
         <w:rPr>
@@ -15355,7 +14973,29 @@
           <w:szCs w:val="24"/>
           <w14:ligatures w14:val="none"/>
         </w:rPr>
-        <w:t xml:space="preserve">n the name </w:t>
+        <w:t>n the name</w:t>
+      </w:r>
+      <w:r>
+        <w:rPr>
+          <w:rFonts w:ascii="Times New Roman" w:hAnsi="Times New Roman" w:cs="Times New Roman"/>
+          <w:iCs/>
+          <w:kern w:val="0"/>
+          <w:sz w:val="24"/>
+          <w:szCs w:val="24"/>
+          <w14:ligatures w14:val="none"/>
+        </w:rPr>
+        <w:t xml:space="preserve"> of</w:t>
+      </w:r>
+      <w:r>
+        <w:rPr>
+          <w:rFonts w:ascii="Times New Roman" w:hAnsi="Times New Roman" w:cs="Times New Roman"/>
+          <w:iCs/>
+          <w:kern w:val="0"/>
+          <w:sz w:val="24"/>
+          <w:szCs w:val="24"/>
+          <w14:ligatures w14:val="none"/>
+        </w:rPr>
+        <w:t xml:space="preserve"> </w:t>
       </w:r>
       <w:r>
         <w:rPr>
@@ -15854,31 +15494,62 @@
           <w:szCs w:val="24"/>
           <w14:ligatures w14:val="none"/>
         </w:rPr>
+        <w:t xml:space="preserve"> are permanent revolution and</w:t>
+      </w:r>
+      <w:r>
+        <w:rPr>
+          <w:rFonts w:ascii="Times New Roman" w:hAnsi="Times New Roman" w:cs="Times New Roman"/>
+          <w:iCs/>
+          <w:kern w:val="0"/>
+          <w:sz w:val="24"/>
+          <w:szCs w:val="24"/>
+          <w14:ligatures w14:val="none"/>
+        </w:rPr>
         <w:t xml:space="preserve"> </w:t>
       </w:r>
-      <w:proofErr w:type="gramStart"/>
-      <w:r>
-        <w:rPr>
-          <w:rFonts w:ascii="Times New Roman" w:hAnsi="Times New Roman" w:cs="Times New Roman"/>
-          <w:iCs/>
-          <w:kern w:val="0"/>
-          <w:sz w:val="24"/>
-          <w:szCs w:val="24"/>
-          <w14:ligatures w14:val="none"/>
-        </w:rPr>
-        <w:t>are</w:t>
-      </w:r>
-      <w:proofErr w:type="gramEnd"/>
-      <w:r>
-        <w:rPr>
-          <w:rFonts w:ascii="Times New Roman" w:hAnsi="Times New Roman" w:cs="Times New Roman"/>
-          <w:iCs/>
-          <w:kern w:val="0"/>
-          <w:sz w:val="24"/>
-          <w:szCs w:val="24"/>
-          <w14:ligatures w14:val="none"/>
-        </w:rPr>
-        <w:t xml:space="preserve"> permanent revolution and</w:t>
+      <w:r>
+        <w:rPr>
+          <w:rFonts w:ascii="Times New Roman" w:hAnsi="Times New Roman" w:cs="Times New Roman"/>
+          <w:iCs/>
+          <w:kern w:val="0"/>
+          <w:sz w:val="24"/>
+          <w:szCs w:val="24"/>
+          <w14:ligatures w14:val="none"/>
+        </w:rPr>
+        <w:t xml:space="preserve">dissatisfaction with any </w:t>
+      </w:r>
+      <w:r>
+        <w:rPr>
+          <w:rFonts w:ascii="Times New Roman" w:hAnsi="Times New Roman" w:cs="Times New Roman"/>
+          <w:iCs/>
+          <w:kern w:val="0"/>
+          <w:sz w:val="24"/>
+          <w:szCs w:val="24"/>
+          <w14:ligatures w14:val="none"/>
+        </w:rPr>
+        <w:t xml:space="preserve">practical </w:t>
+      </w:r>
+      <w:r>
+        <w:rPr>
+          <w:rFonts w:ascii="Times New Roman" w:hAnsi="Times New Roman" w:cs="Times New Roman"/>
+          <w:iCs/>
+          <w:kern w:val="0"/>
+          <w:sz w:val="24"/>
+          <w:szCs w:val="24"/>
+          <w14:ligatures w14:val="none"/>
+        </w:rPr>
+        <w:t>regime</w:t>
+      </w:r>
+      <w:r>
+        <w:rPr>
+          <w:rFonts w:ascii="Times New Roman" w:hAnsi="Times New Roman" w:cs="Times New Roman"/>
+          <w:iCs/>
+          <w:kern w:val="0"/>
+          <w:sz w:val="24"/>
+          <w:szCs w:val="24"/>
+          <w14:ligatures w14:val="none"/>
+        </w:rPr>
+        <w:t>.</w:t>
       </w:r>
       <w:r>
         <w:rPr>
@@ -15900,40 +15571,118 @@
           <w:szCs w:val="24"/>
           <w14:ligatures w14:val="none"/>
         </w:rPr>
-        <w:t xml:space="preserve">dissatisfaction with any </w:t>
-      </w:r>
-      <w:r>
-        <w:rPr>
-          <w:rFonts w:ascii="Times New Roman" w:hAnsi="Times New Roman" w:cs="Times New Roman"/>
-          <w:iCs/>
-          <w:kern w:val="0"/>
-          <w:sz w:val="24"/>
-          <w:szCs w:val="24"/>
-          <w14:ligatures w14:val="none"/>
-        </w:rPr>
-        <w:t xml:space="preserve">practical </w:t>
-      </w:r>
-      <w:r>
-        <w:rPr>
-          <w:rFonts w:ascii="Times New Roman" w:hAnsi="Times New Roman" w:cs="Times New Roman"/>
-          <w:iCs/>
-          <w:kern w:val="0"/>
-          <w:sz w:val="24"/>
-          <w:szCs w:val="24"/>
-          <w14:ligatures w14:val="none"/>
-        </w:rPr>
-        <w:t>regime</w:t>
-      </w:r>
-      <w:r>
-        <w:rPr>
-          <w:rFonts w:ascii="Times New Roman" w:hAnsi="Times New Roman" w:cs="Times New Roman"/>
-          <w:iCs/>
-          <w:kern w:val="0"/>
-          <w:sz w:val="24"/>
-          <w:szCs w:val="24"/>
-          <w14:ligatures w14:val="none"/>
-        </w:rPr>
-        <w:t>.</w:t>
+        <w:t>Th</w:t>
+      </w:r>
+      <w:r>
+        <w:rPr>
+          <w:rFonts w:ascii="Times New Roman" w:hAnsi="Times New Roman" w:cs="Times New Roman"/>
+          <w:iCs/>
+          <w:kern w:val="0"/>
+          <w:sz w:val="24"/>
+          <w:szCs w:val="24"/>
+          <w14:ligatures w14:val="none"/>
+        </w:rPr>
+        <w:t>is</w:t>
+      </w:r>
+      <w:r>
+        <w:rPr>
+          <w:rFonts w:ascii="Times New Roman" w:hAnsi="Times New Roman" w:cs="Times New Roman"/>
+          <w:iCs/>
+          <w:kern w:val="0"/>
+          <w:sz w:val="24"/>
+          <w:szCs w:val="24"/>
+          <w14:ligatures w14:val="none"/>
+        </w:rPr>
+        <w:t xml:space="preserve"> would mean that establishing a</w:t>
+      </w:r>
+      <w:r>
+        <w:rPr>
+          <w:rFonts w:ascii="Times New Roman" w:hAnsi="Times New Roman" w:cs="Times New Roman"/>
+          <w:iCs/>
+          <w:kern w:val="0"/>
+          <w:sz w:val="24"/>
+          <w:szCs w:val="24"/>
+          <w14:ligatures w14:val="none"/>
+        </w:rPr>
+        <w:t>ny</w:t>
+      </w:r>
+      <w:r>
+        <w:rPr>
+          <w:rFonts w:ascii="Times New Roman" w:hAnsi="Times New Roman" w:cs="Times New Roman"/>
+          <w:iCs/>
+          <w:kern w:val="0"/>
+          <w:sz w:val="24"/>
+          <w:szCs w:val="24"/>
+          <w14:ligatures w14:val="none"/>
+        </w:rPr>
+        <w:t xml:space="preserve"> regime </w:t>
+      </w:r>
+      <w:r>
+        <w:rPr>
+          <w:rFonts w:ascii="Times New Roman" w:hAnsi="Times New Roman" w:cs="Times New Roman"/>
+          <w:iCs/>
+          <w:kern w:val="0"/>
+          <w:sz w:val="24"/>
+          <w:szCs w:val="24"/>
+          <w14:ligatures w14:val="none"/>
+        </w:rPr>
+        <w:t>up</w:t>
+      </w:r>
+      <w:r>
+        <w:rPr>
+          <w:rFonts w:ascii="Times New Roman" w:hAnsi="Times New Roman" w:cs="Times New Roman"/>
+          <w:iCs/>
+          <w:kern w:val="0"/>
+          <w:sz w:val="24"/>
+          <w:szCs w:val="24"/>
+          <w14:ligatures w14:val="none"/>
+        </w:rPr>
+        <w:t>on Being is just as susceptible to another revolution in the name of Being.</w:t>
+      </w:r>
+      <w:r>
+        <w:rPr>
+          <w:rFonts w:ascii="Times New Roman" w:hAnsi="Times New Roman" w:cs="Times New Roman"/>
+          <w:iCs/>
+          <w:kern w:val="0"/>
+          <w:sz w:val="24"/>
+          <w:szCs w:val="24"/>
+          <w14:ligatures w14:val="none"/>
+        </w:rPr>
+        <w:t xml:space="preserve"> One scholar summarize</w:t>
+      </w:r>
+      <w:r>
+        <w:rPr>
+          <w:rFonts w:ascii="Times New Roman" w:hAnsi="Times New Roman" w:cs="Times New Roman"/>
+          <w:iCs/>
+          <w:kern w:val="0"/>
+          <w:sz w:val="24"/>
+          <w:szCs w:val="24"/>
+          <w14:ligatures w14:val="none"/>
+        </w:rPr>
+        <w:t>s</w:t>
+      </w:r>
+      <w:r>
+        <w:rPr>
+          <w:rFonts w:ascii="Times New Roman" w:hAnsi="Times New Roman" w:cs="Times New Roman"/>
+          <w:iCs/>
+          <w:kern w:val="0"/>
+          <w:sz w:val="24"/>
+          <w:szCs w:val="24"/>
+          <w14:ligatures w14:val="none"/>
+        </w:rPr>
+        <w:t xml:space="preserve"> perfectly: “Heideggerian politics abjures form; there are no Heideggerian regimes.”</w:t>
+      </w:r>
+      <w:r>
+        <w:rPr>
+          <w:rStyle w:val="FootnoteReference"/>
+          <w:rFonts w:ascii="Times New Roman" w:hAnsi="Times New Roman" w:cs="Times New Roman"/>
+          <w:iCs/>
+          <w:kern w:val="0"/>
+          <w:sz w:val="24"/>
+          <w:szCs w:val="24"/>
+          <w14:ligatures w14:val="none"/>
+        </w:rPr>
+        <w:footnoteReference w:id="23"/>
       </w:r>
       <w:r>
         <w:rPr>
@@ -15955,7 +15704,524 @@
           <w:szCs w:val="24"/>
           <w14:ligatures w14:val="none"/>
         </w:rPr>
-        <w:t>Th</w:t>
+        <w:t xml:space="preserve">Heidegger implores </w:t>
+      </w:r>
+      <w:r>
+        <w:rPr>
+          <w:rFonts w:ascii="Times New Roman" w:hAnsi="Times New Roman" w:cs="Times New Roman"/>
+          <w:iCs/>
+          <w:kern w:val="0"/>
+          <w:sz w:val="24"/>
+          <w:szCs w:val="24"/>
+          <w14:ligatures w14:val="none"/>
+        </w:rPr>
+        <w:t>to not simply</w:t>
+      </w:r>
+      <w:r>
+        <w:rPr>
+          <w:rFonts w:ascii="Times New Roman" w:hAnsi="Times New Roman" w:cs="Times New Roman"/>
+          <w:iCs/>
+          <w:kern w:val="0"/>
+          <w:sz w:val="24"/>
+          <w:szCs w:val="24"/>
+          <w14:ligatures w14:val="none"/>
+        </w:rPr>
+        <w:t xml:space="preserve"> </w:t>
+      </w:r>
+      <w:r>
+        <w:rPr>
+          <w:rFonts w:ascii="Times New Roman" w:hAnsi="Times New Roman" w:cs="Times New Roman"/>
+          <w:iCs/>
+          <w:kern w:val="0"/>
+          <w:sz w:val="24"/>
+          <w:szCs w:val="24"/>
+          <w14:ligatures w14:val="none"/>
+        </w:rPr>
+        <w:t>search for a lost</w:t>
+      </w:r>
+      <w:r>
+        <w:rPr>
+          <w:rFonts w:ascii="Times New Roman" w:hAnsi="Times New Roman" w:cs="Times New Roman"/>
+          <w:iCs/>
+          <w:kern w:val="0"/>
+          <w:sz w:val="24"/>
+          <w:szCs w:val="24"/>
+          <w14:ligatures w14:val="none"/>
+        </w:rPr>
+        <w:t xml:space="preserve"> spiritual wholeness</w:t>
+      </w:r>
+      <w:r>
+        <w:rPr>
+          <w:rFonts w:ascii="Times New Roman" w:hAnsi="Times New Roman" w:cs="Times New Roman"/>
+          <w:iCs/>
+          <w:kern w:val="0"/>
+          <w:sz w:val="24"/>
+          <w:szCs w:val="24"/>
+          <w14:ligatures w14:val="none"/>
+        </w:rPr>
+        <w:t xml:space="preserve"> that may or may not have existed</w:t>
+      </w:r>
+      <w:r>
+        <w:rPr>
+          <w:rFonts w:ascii="Times New Roman" w:hAnsi="Times New Roman" w:cs="Times New Roman"/>
+          <w:iCs/>
+          <w:kern w:val="0"/>
+          <w:sz w:val="24"/>
+          <w:szCs w:val="24"/>
+          <w14:ligatures w14:val="none"/>
+        </w:rPr>
+        <w:t xml:space="preserve">, </w:t>
+      </w:r>
+      <w:r>
+        <w:rPr>
+          <w:rFonts w:ascii="Times New Roman" w:hAnsi="Times New Roman" w:cs="Times New Roman"/>
+          <w:iCs/>
+          <w:kern w:val="0"/>
+          <w:sz w:val="24"/>
+          <w:szCs w:val="24"/>
+          <w14:ligatures w14:val="none"/>
+        </w:rPr>
+        <w:t xml:space="preserve">but to unsettle metaphysics and </w:t>
+      </w:r>
+      <w:r>
+        <w:rPr>
+          <w:rFonts w:ascii="Times New Roman" w:hAnsi="Times New Roman" w:cs="Times New Roman"/>
+          <w:iCs/>
+          <w:kern w:val="0"/>
+          <w:sz w:val="24"/>
+          <w:szCs w:val="24"/>
+          <w14:ligatures w14:val="none"/>
+        </w:rPr>
+        <w:t xml:space="preserve">occidental </w:t>
+      </w:r>
+      <w:r>
+        <w:rPr>
+          <w:rFonts w:ascii="Times New Roman" w:hAnsi="Times New Roman" w:cs="Times New Roman"/>
+          <w:iCs/>
+          <w:kern w:val="0"/>
+          <w:sz w:val="24"/>
+          <w:szCs w:val="24"/>
+          <w14:ligatures w14:val="none"/>
+        </w:rPr>
+        <w:t xml:space="preserve">rationality </w:t>
+      </w:r>
+      <w:r>
+        <w:rPr>
+          <w:rFonts w:ascii="Times New Roman" w:hAnsi="Times New Roman" w:cs="Times New Roman"/>
+          <w:iCs/>
+          <w:kern w:val="0"/>
+          <w:sz w:val="24"/>
+          <w:szCs w:val="24"/>
+          <w14:ligatures w14:val="none"/>
+        </w:rPr>
+        <w:t>for</w:t>
+      </w:r>
+      <w:r>
+        <w:rPr>
+          <w:rFonts w:ascii="Times New Roman" w:hAnsi="Times New Roman" w:cs="Times New Roman"/>
+          <w:iCs/>
+          <w:kern w:val="0"/>
+          <w:sz w:val="24"/>
+          <w:szCs w:val="24"/>
+          <w14:ligatures w14:val="none"/>
+        </w:rPr>
+        <w:t xml:space="preserve"> spiritual renewal in the name of</w:t>
+      </w:r>
+      <w:r>
+        <w:rPr>
+          <w:rFonts w:ascii="Times New Roman" w:hAnsi="Times New Roman" w:cs="Times New Roman"/>
+          <w:iCs/>
+          <w:kern w:val="0"/>
+          <w:sz w:val="24"/>
+          <w:szCs w:val="24"/>
+          <w14:ligatures w14:val="none"/>
+        </w:rPr>
+        <w:t xml:space="preserve"> futural</w:t>
+      </w:r>
+      <w:r>
+        <w:rPr>
+          <w:rFonts w:ascii="Times New Roman" w:hAnsi="Times New Roman" w:cs="Times New Roman"/>
+          <w:iCs/>
+          <w:kern w:val="0"/>
+          <w:sz w:val="24"/>
+          <w:szCs w:val="24"/>
+          <w14:ligatures w14:val="none"/>
+        </w:rPr>
+        <w:t xml:space="preserve"> possib</w:t>
+      </w:r>
+      <w:r>
+        <w:rPr>
+          <w:rFonts w:ascii="Times New Roman" w:hAnsi="Times New Roman" w:cs="Times New Roman"/>
+          <w:iCs/>
+          <w:kern w:val="0"/>
+          <w:sz w:val="24"/>
+          <w:szCs w:val="24"/>
+          <w14:ligatures w14:val="none"/>
+        </w:rPr>
+        <w:t>ilities</w:t>
+      </w:r>
+      <w:r>
+        <w:rPr>
+          <w:rFonts w:ascii="Times New Roman" w:hAnsi="Times New Roman" w:cs="Times New Roman"/>
+          <w:iCs/>
+          <w:kern w:val="0"/>
+          <w:sz w:val="24"/>
+          <w:szCs w:val="24"/>
+          <w14:ligatures w14:val="none"/>
+        </w:rPr>
+        <w:t>. T</w:t>
+      </w:r>
+      <w:r>
+        <w:rPr>
+          <w:rFonts w:ascii="Times New Roman" w:hAnsi="Times New Roman" w:cs="Times New Roman"/>
+          <w:iCs/>
+          <w:kern w:val="0"/>
+          <w:sz w:val="24"/>
+          <w:szCs w:val="24"/>
+          <w14:ligatures w14:val="none"/>
+        </w:rPr>
+        <w:t>h</w:t>
+      </w:r>
+      <w:r>
+        <w:rPr>
+          <w:rFonts w:ascii="Times New Roman" w:hAnsi="Times New Roman" w:cs="Times New Roman"/>
+          <w:iCs/>
+          <w:kern w:val="0"/>
+          <w:sz w:val="24"/>
+          <w:szCs w:val="24"/>
+          <w14:ligatures w14:val="none"/>
+        </w:rPr>
+        <w:t>is is</w:t>
+      </w:r>
+      <w:r>
+        <w:rPr>
+          <w:rFonts w:ascii="Times New Roman" w:hAnsi="Times New Roman" w:cs="Times New Roman"/>
+          <w:iCs/>
+          <w:kern w:val="0"/>
+          <w:sz w:val="24"/>
+          <w:szCs w:val="24"/>
+          <w14:ligatures w14:val="none"/>
+        </w:rPr>
+        <w:t xml:space="preserve"> his ultimate authority </w:t>
+      </w:r>
+      <w:r>
+        <w:rPr>
+          <w:rFonts w:ascii="Times New Roman" w:hAnsi="Times New Roman" w:cs="Times New Roman"/>
+          <w:iCs/>
+          <w:kern w:val="0"/>
+          <w:sz w:val="24"/>
+          <w:szCs w:val="24"/>
+          <w14:ligatures w14:val="none"/>
+        </w:rPr>
+        <w:t>for a</w:t>
+      </w:r>
+      <w:r>
+        <w:rPr>
+          <w:rFonts w:ascii="Times New Roman" w:hAnsi="Times New Roman" w:cs="Times New Roman"/>
+          <w:iCs/>
+          <w:kern w:val="0"/>
+          <w:sz w:val="24"/>
+          <w:szCs w:val="24"/>
+          <w14:ligatures w14:val="none"/>
+        </w:rPr>
+        <w:t xml:space="preserve"> state </w:t>
+      </w:r>
+      <w:r>
+        <w:rPr>
+          <w:rFonts w:ascii="Times New Roman" w:hAnsi="Times New Roman" w:cs="Times New Roman"/>
+          <w:iCs/>
+          <w:kern w:val="0"/>
+          <w:sz w:val="24"/>
+          <w:szCs w:val="24"/>
+          <w14:ligatures w14:val="none"/>
+        </w:rPr>
+        <w:t>of Being</w:t>
+      </w:r>
+      <w:r>
+        <w:rPr>
+          <w:rFonts w:ascii="Times New Roman" w:hAnsi="Times New Roman" w:cs="Times New Roman"/>
+          <w:iCs/>
+          <w:kern w:val="0"/>
+          <w:sz w:val="24"/>
+          <w:szCs w:val="24"/>
+          <w14:ligatures w14:val="none"/>
+        </w:rPr>
+        <w:t>, which cannot translate practical</w:t>
+      </w:r>
+      <w:r>
+        <w:rPr>
+          <w:rFonts w:ascii="Times New Roman" w:hAnsi="Times New Roman" w:cs="Times New Roman"/>
+          <w:iCs/>
+          <w:kern w:val="0"/>
+          <w:sz w:val="24"/>
+          <w:szCs w:val="24"/>
+          <w14:ligatures w14:val="none"/>
+        </w:rPr>
+        <w:t>ly</w:t>
+      </w:r>
+      <w:r>
+        <w:rPr>
+          <w:rFonts w:ascii="Times New Roman" w:hAnsi="Times New Roman" w:cs="Times New Roman"/>
+          <w:iCs/>
+          <w:kern w:val="0"/>
+          <w:sz w:val="24"/>
+          <w:szCs w:val="24"/>
+          <w14:ligatures w14:val="none"/>
+        </w:rPr>
+        <w:t xml:space="preserve"> unless there is some permanency of</w:t>
+      </w:r>
+      <w:r>
+        <w:rPr>
+          <w:rFonts w:ascii="Times New Roman" w:hAnsi="Times New Roman" w:cs="Times New Roman"/>
+          <w:iCs/>
+          <w:kern w:val="0"/>
+          <w:sz w:val="24"/>
+          <w:szCs w:val="24"/>
+          <w14:ligatures w14:val="none"/>
+        </w:rPr>
+        <w:t xml:space="preserve"> a particular</w:t>
+      </w:r>
+      <w:r>
+        <w:rPr>
+          <w:rFonts w:ascii="Times New Roman" w:hAnsi="Times New Roman" w:cs="Times New Roman"/>
+          <w:iCs/>
+          <w:kern w:val="0"/>
+          <w:sz w:val="24"/>
+          <w:szCs w:val="24"/>
+          <w14:ligatures w14:val="none"/>
+        </w:rPr>
+        <w:t>ist</w:t>
+      </w:r>
+      <w:r>
+        <w:rPr>
+          <w:rFonts w:ascii="Times New Roman" w:hAnsi="Times New Roman" w:cs="Times New Roman"/>
+          <w:iCs/>
+          <w:kern w:val="0"/>
+          <w:sz w:val="24"/>
+          <w:szCs w:val="24"/>
+          <w14:ligatures w14:val="none"/>
+        </w:rPr>
+        <w:t xml:space="preserve"> revolution, constantly eluding metaphysical form</w:t>
+      </w:r>
+      <w:r>
+        <w:rPr>
+          <w:rFonts w:ascii="Times New Roman" w:hAnsi="Times New Roman" w:cs="Times New Roman"/>
+          <w:iCs/>
+          <w:kern w:val="0"/>
+          <w:sz w:val="24"/>
+          <w:szCs w:val="24"/>
+          <w14:ligatures w14:val="none"/>
+        </w:rPr>
+        <w:t>. Life may</w:t>
+      </w:r>
+      <w:r>
+        <w:rPr>
+          <w:rFonts w:ascii="Times New Roman" w:hAnsi="Times New Roman" w:cs="Times New Roman"/>
+          <w:iCs/>
+          <w:kern w:val="0"/>
+          <w:sz w:val="24"/>
+          <w:szCs w:val="24"/>
+          <w14:ligatures w14:val="none"/>
+        </w:rPr>
+        <w:t>, at times,</w:t>
+      </w:r>
+      <w:r>
+        <w:rPr>
+          <w:rFonts w:ascii="Times New Roman" w:hAnsi="Times New Roman" w:cs="Times New Roman"/>
+          <w:iCs/>
+          <w:kern w:val="0"/>
+          <w:sz w:val="24"/>
+          <w:szCs w:val="24"/>
+          <w14:ligatures w14:val="none"/>
+        </w:rPr>
+        <w:t xml:space="preserve"> feel </w:t>
+      </w:r>
+      <w:r>
+        <w:rPr>
+          <w:rFonts w:ascii="Times New Roman" w:hAnsi="Times New Roman" w:cs="Times New Roman"/>
+          <w:iCs/>
+          <w:kern w:val="0"/>
+          <w:sz w:val="24"/>
+          <w:szCs w:val="24"/>
+          <w14:ligatures w14:val="none"/>
+        </w:rPr>
+        <w:t>substantially</w:t>
+      </w:r>
+      <w:r>
+        <w:rPr>
+          <w:rFonts w:ascii="Times New Roman" w:hAnsi="Times New Roman" w:cs="Times New Roman"/>
+          <w:iCs/>
+          <w:kern w:val="0"/>
+          <w:sz w:val="24"/>
+          <w:szCs w:val="24"/>
+          <w14:ligatures w14:val="none"/>
+        </w:rPr>
+        <w:t xml:space="preserve"> void</w:t>
+      </w:r>
+      <w:r>
+        <w:rPr>
+          <w:rFonts w:ascii="Times New Roman" w:hAnsi="Times New Roman" w:cs="Times New Roman"/>
+          <w:iCs/>
+          <w:kern w:val="0"/>
+          <w:sz w:val="24"/>
+          <w:szCs w:val="24"/>
+          <w14:ligatures w14:val="none"/>
+        </w:rPr>
+        <w:t xml:space="preserve">, and undoubtedly a liberal doctrine </w:t>
+      </w:r>
+      <w:r>
+        <w:rPr>
+          <w:rFonts w:ascii="Times New Roman" w:hAnsi="Times New Roman" w:cs="Times New Roman"/>
+          <w:iCs/>
+          <w:kern w:val="0"/>
+          <w:sz w:val="24"/>
+          <w:szCs w:val="24"/>
+          <w14:ligatures w14:val="none"/>
+        </w:rPr>
+        <w:t xml:space="preserve">of statehood </w:t>
+      </w:r>
+      <w:r>
+        <w:rPr>
+          <w:rFonts w:ascii="Times New Roman" w:hAnsi="Times New Roman" w:cs="Times New Roman"/>
+          <w:iCs/>
+          <w:kern w:val="0"/>
+          <w:sz w:val="24"/>
+          <w:szCs w:val="24"/>
+          <w14:ligatures w14:val="none"/>
+        </w:rPr>
+        <w:t xml:space="preserve">deriving from the Enlightenment </w:t>
+      </w:r>
+      <w:r>
+        <w:rPr>
+          <w:rFonts w:ascii="Times New Roman" w:hAnsi="Times New Roman" w:cs="Times New Roman"/>
+          <w:iCs/>
+          <w:kern w:val="0"/>
+          <w:sz w:val="24"/>
+          <w:szCs w:val="24"/>
+          <w14:ligatures w14:val="none"/>
+        </w:rPr>
+        <w:t xml:space="preserve">may </w:t>
+      </w:r>
+      <w:r>
+        <w:rPr>
+          <w:rFonts w:ascii="Times New Roman" w:hAnsi="Times New Roman" w:cs="Times New Roman"/>
+          <w:iCs/>
+          <w:kern w:val="0"/>
+          <w:sz w:val="24"/>
+          <w:szCs w:val="24"/>
+          <w14:ligatures w14:val="none"/>
+        </w:rPr>
+        <w:t>contribute to this feeling</w:t>
+      </w:r>
+      <w:r>
+        <w:rPr>
+          <w:rFonts w:ascii="Times New Roman" w:hAnsi="Times New Roman" w:cs="Times New Roman"/>
+          <w:iCs/>
+          <w:kern w:val="0"/>
+          <w:sz w:val="24"/>
+          <w:szCs w:val="24"/>
+          <w14:ligatures w14:val="none"/>
+        </w:rPr>
+        <w:t>. B</w:t>
+      </w:r>
+      <w:r>
+        <w:rPr>
+          <w:rFonts w:ascii="Times New Roman" w:hAnsi="Times New Roman" w:cs="Times New Roman"/>
+          <w:iCs/>
+          <w:kern w:val="0"/>
+          <w:sz w:val="24"/>
+          <w:szCs w:val="24"/>
+          <w14:ligatures w14:val="none"/>
+        </w:rPr>
+        <w:t xml:space="preserve">ut a people </w:t>
+      </w:r>
+      <w:r>
+        <w:rPr>
+          <w:rFonts w:ascii="Times New Roman" w:hAnsi="Times New Roman" w:cs="Times New Roman"/>
+          <w:iCs/>
+          <w:kern w:val="0"/>
+          <w:sz w:val="24"/>
+          <w:szCs w:val="24"/>
+          <w14:ligatures w14:val="none"/>
+        </w:rPr>
+        <w:t>who</w:t>
+      </w:r>
+      <w:r>
+        <w:rPr>
+          <w:rFonts w:ascii="Times New Roman" w:hAnsi="Times New Roman" w:cs="Times New Roman"/>
+          <w:iCs/>
+          <w:kern w:val="0"/>
+          <w:sz w:val="24"/>
+          <w:szCs w:val="24"/>
+          <w14:ligatures w14:val="none"/>
+        </w:rPr>
+        <w:t xml:space="preserve"> practically implement and legi</w:t>
+      </w:r>
+      <w:r>
+        <w:rPr>
+          <w:rFonts w:ascii="Times New Roman" w:hAnsi="Times New Roman" w:cs="Times New Roman"/>
+          <w:iCs/>
+          <w:kern w:val="0"/>
+          <w:sz w:val="24"/>
+          <w:szCs w:val="24"/>
+          <w14:ligatures w14:val="none"/>
+        </w:rPr>
+        <w:t>slate</w:t>
+      </w:r>
+      <w:r>
+        <w:rPr>
+          <w:rFonts w:ascii="Times New Roman" w:hAnsi="Times New Roman" w:cs="Times New Roman"/>
+          <w:iCs/>
+          <w:kern w:val="0"/>
+          <w:sz w:val="24"/>
+          <w:szCs w:val="24"/>
+          <w14:ligatures w14:val="none"/>
+        </w:rPr>
+        <w:t xml:space="preserve"> a spiritual renewal</w:t>
+      </w:r>
+      <w:r>
+        <w:rPr>
+          <w:rFonts w:ascii="Times New Roman" w:hAnsi="Times New Roman" w:cs="Times New Roman"/>
+          <w:iCs/>
+          <w:kern w:val="0"/>
+          <w:sz w:val="24"/>
+          <w:szCs w:val="24"/>
+          <w14:ligatures w14:val="none"/>
+        </w:rPr>
+        <w:t xml:space="preserve"> </w:t>
+      </w:r>
+      <w:r>
+        <w:rPr>
+          <w:rFonts w:ascii="Times New Roman" w:hAnsi="Times New Roman" w:cs="Times New Roman"/>
+          <w:iCs/>
+          <w:kern w:val="0"/>
+          <w:sz w:val="24"/>
+          <w:szCs w:val="24"/>
+          <w14:ligatures w14:val="none"/>
+        </w:rPr>
+        <w:t>in the name of</w:t>
+      </w:r>
+      <w:r>
+        <w:rPr>
+          <w:rFonts w:ascii="Times New Roman" w:hAnsi="Times New Roman" w:cs="Times New Roman"/>
+          <w:iCs/>
+          <w:kern w:val="0"/>
+          <w:sz w:val="24"/>
+          <w:szCs w:val="24"/>
+          <w14:ligatures w14:val="none"/>
+        </w:rPr>
+        <w:t xml:space="preserve"> Being will</w:t>
+      </w:r>
+      <w:r>
+        <w:rPr>
+          <w:rFonts w:ascii="Times New Roman" w:hAnsi="Times New Roman" w:cs="Times New Roman"/>
+          <w:iCs/>
+          <w:kern w:val="0"/>
+          <w:sz w:val="24"/>
+          <w:szCs w:val="24"/>
+          <w14:ligatures w14:val="none"/>
+        </w:rPr>
+        <w:t xml:space="preserve"> not find the grass </w:t>
       </w:r>
       <w:r>
         <w:rPr>
@@ -15977,671 +16243,8 @@
           <w:szCs w:val="24"/>
           <w14:ligatures w14:val="none"/>
         </w:rPr>
-        <w:t xml:space="preserve"> would mean that establishing a</w:t>
-      </w:r>
-      <w:r>
-        <w:rPr>
-          <w:rFonts w:ascii="Times New Roman" w:hAnsi="Times New Roman" w:cs="Times New Roman"/>
-          <w:iCs/>
-          <w:kern w:val="0"/>
-          <w:sz w:val="24"/>
-          <w:szCs w:val="24"/>
-          <w14:ligatures w14:val="none"/>
-        </w:rPr>
-        <w:t>ny</w:t>
-      </w:r>
-      <w:r>
-        <w:rPr>
-          <w:rFonts w:ascii="Times New Roman" w:hAnsi="Times New Roman" w:cs="Times New Roman"/>
-          <w:iCs/>
-          <w:kern w:val="0"/>
-          <w:sz w:val="24"/>
-          <w:szCs w:val="24"/>
-          <w14:ligatures w14:val="none"/>
-        </w:rPr>
-        <w:t xml:space="preserve"> regime </w:t>
-      </w:r>
-      <w:r>
-        <w:rPr>
-          <w:rFonts w:ascii="Times New Roman" w:hAnsi="Times New Roman" w:cs="Times New Roman"/>
-          <w:iCs/>
-          <w:kern w:val="0"/>
-          <w:sz w:val="24"/>
-          <w:szCs w:val="24"/>
-          <w14:ligatures w14:val="none"/>
-        </w:rPr>
-        <w:t>up</w:t>
-      </w:r>
-      <w:r>
-        <w:rPr>
-          <w:rFonts w:ascii="Times New Roman" w:hAnsi="Times New Roman" w:cs="Times New Roman"/>
-          <w:iCs/>
-          <w:kern w:val="0"/>
-          <w:sz w:val="24"/>
-          <w:szCs w:val="24"/>
-          <w14:ligatures w14:val="none"/>
-        </w:rPr>
-        <w:t>on Being is just as susceptible to another revolution in the name of Being.</w:t>
-      </w:r>
-      <w:r>
-        <w:rPr>
-          <w:rFonts w:ascii="Times New Roman" w:hAnsi="Times New Roman" w:cs="Times New Roman"/>
-          <w:iCs/>
-          <w:kern w:val="0"/>
-          <w:sz w:val="24"/>
-          <w:szCs w:val="24"/>
-          <w14:ligatures w14:val="none"/>
-        </w:rPr>
-        <w:t xml:space="preserve"> One scholar summarize</w:t>
-      </w:r>
-      <w:r>
-        <w:rPr>
-          <w:rFonts w:ascii="Times New Roman" w:hAnsi="Times New Roman" w:cs="Times New Roman"/>
-          <w:iCs/>
-          <w:kern w:val="0"/>
-          <w:sz w:val="24"/>
-          <w:szCs w:val="24"/>
-          <w14:ligatures w14:val="none"/>
-        </w:rPr>
-        <w:t>s</w:t>
-      </w:r>
-      <w:r>
-        <w:rPr>
-          <w:rFonts w:ascii="Times New Roman" w:hAnsi="Times New Roman" w:cs="Times New Roman"/>
-          <w:iCs/>
-          <w:kern w:val="0"/>
-          <w:sz w:val="24"/>
-          <w:szCs w:val="24"/>
-          <w14:ligatures w14:val="none"/>
-        </w:rPr>
-        <w:t xml:space="preserve"> perfectly: “Heideggerian politics abjures form; there are no Heideggerian regimes.”</w:t>
-      </w:r>
-      <w:r>
-        <w:rPr>
-          <w:rStyle w:val="FootnoteReference"/>
-          <w:rFonts w:ascii="Times New Roman" w:hAnsi="Times New Roman" w:cs="Times New Roman"/>
-          <w:iCs/>
-          <w:kern w:val="0"/>
-          <w:sz w:val="24"/>
-          <w:szCs w:val="24"/>
-          <w14:ligatures w14:val="none"/>
-        </w:rPr>
-        <w:footnoteReference w:id="23"/>
-      </w:r>
-      <w:r>
-        <w:rPr>
-          <w:rFonts w:ascii="Times New Roman" w:hAnsi="Times New Roman" w:cs="Times New Roman"/>
-          <w:iCs/>
-          <w:kern w:val="0"/>
-          <w:sz w:val="24"/>
-          <w:szCs w:val="24"/>
-          <w14:ligatures w14:val="none"/>
-        </w:rPr>
-        <w:t xml:space="preserve"> </w:t>
-      </w:r>
-      <w:r>
-        <w:rPr>
-          <w:rFonts w:ascii="Times New Roman" w:hAnsi="Times New Roman" w:cs="Times New Roman"/>
-          <w:iCs/>
-          <w:kern w:val="0"/>
-          <w:sz w:val="24"/>
-          <w:szCs w:val="24"/>
-          <w14:ligatures w14:val="none"/>
-        </w:rPr>
-        <w:t xml:space="preserve">Heidegger implores </w:t>
-      </w:r>
-      <w:r>
-        <w:rPr>
-          <w:rFonts w:ascii="Times New Roman" w:hAnsi="Times New Roman" w:cs="Times New Roman"/>
-          <w:iCs/>
-          <w:kern w:val="0"/>
-          <w:sz w:val="24"/>
-          <w:szCs w:val="24"/>
-          <w14:ligatures w14:val="none"/>
-        </w:rPr>
-        <w:t>to not simply</w:t>
-      </w:r>
-      <w:r>
-        <w:rPr>
-          <w:rFonts w:ascii="Times New Roman" w:hAnsi="Times New Roman" w:cs="Times New Roman"/>
-          <w:iCs/>
-          <w:kern w:val="0"/>
-          <w:sz w:val="24"/>
-          <w:szCs w:val="24"/>
-          <w14:ligatures w14:val="none"/>
-        </w:rPr>
-        <w:t xml:space="preserve"> </w:t>
-      </w:r>
-      <w:r>
-        <w:rPr>
-          <w:rFonts w:ascii="Times New Roman" w:hAnsi="Times New Roman" w:cs="Times New Roman"/>
-          <w:iCs/>
-          <w:kern w:val="0"/>
-          <w:sz w:val="24"/>
-          <w:szCs w:val="24"/>
-          <w14:ligatures w14:val="none"/>
-        </w:rPr>
-        <w:t>search for a lost</w:t>
-      </w:r>
-      <w:r>
-        <w:rPr>
-          <w:rFonts w:ascii="Times New Roman" w:hAnsi="Times New Roman" w:cs="Times New Roman"/>
-          <w:iCs/>
-          <w:kern w:val="0"/>
-          <w:sz w:val="24"/>
-          <w:szCs w:val="24"/>
-          <w14:ligatures w14:val="none"/>
-        </w:rPr>
-        <w:t xml:space="preserve"> spiritual wholeness</w:t>
-      </w:r>
-      <w:r>
-        <w:rPr>
-          <w:rFonts w:ascii="Times New Roman" w:hAnsi="Times New Roman" w:cs="Times New Roman"/>
-          <w:iCs/>
-          <w:kern w:val="0"/>
-          <w:sz w:val="24"/>
-          <w:szCs w:val="24"/>
-          <w14:ligatures w14:val="none"/>
-        </w:rPr>
-        <w:t xml:space="preserve"> that may or may not have existed</w:t>
-      </w:r>
-      <w:r>
-        <w:rPr>
-          <w:rFonts w:ascii="Times New Roman" w:hAnsi="Times New Roman" w:cs="Times New Roman"/>
-          <w:iCs/>
-          <w:kern w:val="0"/>
-          <w:sz w:val="24"/>
-          <w:szCs w:val="24"/>
-          <w14:ligatures w14:val="none"/>
-        </w:rPr>
-        <w:t xml:space="preserve">, </w:t>
-      </w:r>
-      <w:r>
-        <w:rPr>
-          <w:rFonts w:ascii="Times New Roman" w:hAnsi="Times New Roman" w:cs="Times New Roman"/>
-          <w:iCs/>
-          <w:kern w:val="0"/>
-          <w:sz w:val="24"/>
-          <w:szCs w:val="24"/>
-          <w14:ligatures w14:val="none"/>
-        </w:rPr>
-        <w:t xml:space="preserve">but to unsettle metaphysics and </w:t>
-      </w:r>
-      <w:r>
-        <w:rPr>
-          <w:rFonts w:ascii="Times New Roman" w:hAnsi="Times New Roman" w:cs="Times New Roman"/>
-          <w:iCs/>
-          <w:kern w:val="0"/>
-          <w:sz w:val="24"/>
-          <w:szCs w:val="24"/>
-          <w14:ligatures w14:val="none"/>
-        </w:rPr>
-        <w:t xml:space="preserve">occidental </w:t>
-      </w:r>
-      <w:r>
-        <w:rPr>
-          <w:rFonts w:ascii="Times New Roman" w:hAnsi="Times New Roman" w:cs="Times New Roman"/>
-          <w:iCs/>
-          <w:kern w:val="0"/>
-          <w:sz w:val="24"/>
-          <w:szCs w:val="24"/>
-          <w14:ligatures w14:val="none"/>
-        </w:rPr>
-        <w:t xml:space="preserve">rationality </w:t>
-      </w:r>
-      <w:r>
-        <w:rPr>
-          <w:rFonts w:ascii="Times New Roman" w:hAnsi="Times New Roman" w:cs="Times New Roman"/>
-          <w:iCs/>
-          <w:kern w:val="0"/>
-          <w:sz w:val="24"/>
-          <w:szCs w:val="24"/>
-          <w14:ligatures w14:val="none"/>
-        </w:rPr>
-        <w:t>for</w:t>
-      </w:r>
-      <w:r>
-        <w:rPr>
-          <w:rFonts w:ascii="Times New Roman" w:hAnsi="Times New Roman" w:cs="Times New Roman"/>
-          <w:iCs/>
-          <w:kern w:val="0"/>
-          <w:sz w:val="24"/>
-          <w:szCs w:val="24"/>
-          <w14:ligatures w14:val="none"/>
-        </w:rPr>
-        <w:t xml:space="preserve"> spiritual renewal in the name of</w:t>
-      </w:r>
-      <w:r>
-        <w:rPr>
-          <w:rFonts w:ascii="Times New Roman" w:hAnsi="Times New Roman" w:cs="Times New Roman"/>
-          <w:iCs/>
-          <w:kern w:val="0"/>
-          <w:sz w:val="24"/>
-          <w:szCs w:val="24"/>
-          <w14:ligatures w14:val="none"/>
-        </w:rPr>
-        <w:t xml:space="preserve"> futural</w:t>
-      </w:r>
-      <w:r>
-        <w:rPr>
-          <w:rFonts w:ascii="Times New Roman" w:hAnsi="Times New Roman" w:cs="Times New Roman"/>
-          <w:iCs/>
-          <w:kern w:val="0"/>
-          <w:sz w:val="24"/>
-          <w:szCs w:val="24"/>
-          <w14:ligatures w14:val="none"/>
-        </w:rPr>
-        <w:t xml:space="preserve"> possib</w:t>
-      </w:r>
-      <w:r>
-        <w:rPr>
-          <w:rFonts w:ascii="Times New Roman" w:hAnsi="Times New Roman" w:cs="Times New Roman"/>
-          <w:iCs/>
-          <w:kern w:val="0"/>
-          <w:sz w:val="24"/>
-          <w:szCs w:val="24"/>
-          <w14:ligatures w14:val="none"/>
-        </w:rPr>
-        <w:t>ilities</w:t>
-      </w:r>
-      <w:r>
-        <w:rPr>
-          <w:rFonts w:ascii="Times New Roman" w:hAnsi="Times New Roman" w:cs="Times New Roman"/>
-          <w:iCs/>
-          <w:kern w:val="0"/>
-          <w:sz w:val="24"/>
-          <w:szCs w:val="24"/>
-          <w14:ligatures w14:val="none"/>
-        </w:rPr>
-        <w:t>. T</w:t>
-      </w:r>
-      <w:r>
-        <w:rPr>
-          <w:rFonts w:ascii="Times New Roman" w:hAnsi="Times New Roman" w:cs="Times New Roman"/>
-          <w:iCs/>
-          <w:kern w:val="0"/>
-          <w:sz w:val="24"/>
-          <w:szCs w:val="24"/>
-          <w14:ligatures w14:val="none"/>
-        </w:rPr>
-        <w:t>h</w:t>
-      </w:r>
-      <w:r>
-        <w:rPr>
-          <w:rFonts w:ascii="Times New Roman" w:hAnsi="Times New Roman" w:cs="Times New Roman"/>
-          <w:iCs/>
-          <w:kern w:val="0"/>
-          <w:sz w:val="24"/>
-          <w:szCs w:val="24"/>
-          <w14:ligatures w14:val="none"/>
-        </w:rPr>
-        <w:t>is is</w:t>
-      </w:r>
-      <w:r>
-        <w:rPr>
-          <w:rFonts w:ascii="Times New Roman" w:hAnsi="Times New Roman" w:cs="Times New Roman"/>
-          <w:iCs/>
-          <w:kern w:val="0"/>
-          <w:sz w:val="24"/>
-          <w:szCs w:val="24"/>
-          <w14:ligatures w14:val="none"/>
-        </w:rPr>
-        <w:t xml:space="preserve"> his ultimate authority </w:t>
-      </w:r>
-      <w:r>
-        <w:rPr>
-          <w:rFonts w:ascii="Times New Roman" w:hAnsi="Times New Roman" w:cs="Times New Roman"/>
-          <w:iCs/>
-          <w:kern w:val="0"/>
-          <w:sz w:val="24"/>
-          <w:szCs w:val="24"/>
-          <w14:ligatures w14:val="none"/>
-        </w:rPr>
-        <w:t>for a</w:t>
-      </w:r>
-      <w:r>
-        <w:rPr>
-          <w:rFonts w:ascii="Times New Roman" w:hAnsi="Times New Roman" w:cs="Times New Roman"/>
-          <w:iCs/>
-          <w:kern w:val="0"/>
-          <w:sz w:val="24"/>
-          <w:szCs w:val="24"/>
-          <w14:ligatures w14:val="none"/>
-        </w:rPr>
-        <w:t xml:space="preserve"> state </w:t>
-      </w:r>
-      <w:r>
-        <w:rPr>
-          <w:rFonts w:ascii="Times New Roman" w:hAnsi="Times New Roman" w:cs="Times New Roman"/>
-          <w:iCs/>
-          <w:kern w:val="0"/>
-          <w:sz w:val="24"/>
-          <w:szCs w:val="24"/>
-          <w14:ligatures w14:val="none"/>
-        </w:rPr>
-        <w:t>of Being</w:t>
-      </w:r>
-      <w:r>
-        <w:rPr>
-          <w:rFonts w:ascii="Times New Roman" w:hAnsi="Times New Roman" w:cs="Times New Roman"/>
-          <w:iCs/>
-          <w:kern w:val="0"/>
-          <w:sz w:val="24"/>
-          <w:szCs w:val="24"/>
-          <w14:ligatures w14:val="none"/>
-        </w:rPr>
-        <w:t>, which cannot translate practical</w:t>
-      </w:r>
-      <w:r>
-        <w:rPr>
-          <w:rFonts w:ascii="Times New Roman" w:hAnsi="Times New Roman" w:cs="Times New Roman"/>
-          <w:iCs/>
-          <w:kern w:val="0"/>
-          <w:sz w:val="24"/>
-          <w:szCs w:val="24"/>
-          <w14:ligatures w14:val="none"/>
-        </w:rPr>
-        <w:t>ly</w:t>
-      </w:r>
-      <w:r>
-        <w:rPr>
-          <w:rFonts w:ascii="Times New Roman" w:hAnsi="Times New Roman" w:cs="Times New Roman"/>
-          <w:iCs/>
-          <w:kern w:val="0"/>
-          <w:sz w:val="24"/>
-          <w:szCs w:val="24"/>
-          <w14:ligatures w14:val="none"/>
-        </w:rPr>
-        <w:t xml:space="preserve"> unless there is some permanency of</w:t>
-      </w:r>
-      <w:r>
-        <w:rPr>
-          <w:rFonts w:ascii="Times New Roman" w:hAnsi="Times New Roman" w:cs="Times New Roman"/>
-          <w:iCs/>
-          <w:kern w:val="0"/>
-          <w:sz w:val="24"/>
-          <w:szCs w:val="24"/>
-          <w14:ligatures w14:val="none"/>
-        </w:rPr>
-        <w:t xml:space="preserve"> a particular</w:t>
-      </w:r>
-      <w:r>
-        <w:rPr>
-          <w:rFonts w:ascii="Times New Roman" w:hAnsi="Times New Roman" w:cs="Times New Roman"/>
-          <w:iCs/>
-          <w:kern w:val="0"/>
-          <w:sz w:val="24"/>
-          <w:szCs w:val="24"/>
-          <w14:ligatures w14:val="none"/>
-        </w:rPr>
-        <w:t>ist</w:t>
-      </w:r>
-      <w:r>
-        <w:rPr>
-          <w:rFonts w:ascii="Times New Roman" w:hAnsi="Times New Roman" w:cs="Times New Roman"/>
-          <w:iCs/>
-          <w:kern w:val="0"/>
-          <w:sz w:val="24"/>
-          <w:szCs w:val="24"/>
-          <w14:ligatures w14:val="none"/>
-        </w:rPr>
-        <w:t xml:space="preserve"> revolution, constantly eluding metaphysical form</w:t>
-      </w:r>
-      <w:r>
-        <w:rPr>
-          <w:rFonts w:ascii="Times New Roman" w:hAnsi="Times New Roman" w:cs="Times New Roman"/>
-          <w:iCs/>
-          <w:kern w:val="0"/>
-          <w:sz w:val="24"/>
-          <w:szCs w:val="24"/>
-          <w14:ligatures w14:val="none"/>
-        </w:rPr>
-        <w:t>. Life may</w:t>
-      </w:r>
-      <w:r>
-        <w:rPr>
-          <w:rFonts w:ascii="Times New Roman" w:hAnsi="Times New Roman" w:cs="Times New Roman"/>
-          <w:iCs/>
-          <w:kern w:val="0"/>
-          <w:sz w:val="24"/>
-          <w:szCs w:val="24"/>
-          <w14:ligatures w14:val="none"/>
-        </w:rPr>
-        <w:t>, at times,</w:t>
-      </w:r>
-      <w:r>
-        <w:rPr>
-          <w:rFonts w:ascii="Times New Roman" w:hAnsi="Times New Roman" w:cs="Times New Roman"/>
-          <w:iCs/>
-          <w:kern w:val="0"/>
-          <w:sz w:val="24"/>
-          <w:szCs w:val="24"/>
-          <w14:ligatures w14:val="none"/>
-        </w:rPr>
-        <w:t xml:space="preserve"> feel </w:t>
-      </w:r>
-      <w:r>
-        <w:rPr>
-          <w:rFonts w:ascii="Times New Roman" w:hAnsi="Times New Roman" w:cs="Times New Roman"/>
-          <w:iCs/>
-          <w:kern w:val="0"/>
-          <w:sz w:val="24"/>
-          <w:szCs w:val="24"/>
-          <w14:ligatures w14:val="none"/>
-        </w:rPr>
-        <w:t>substantially</w:t>
-      </w:r>
-      <w:r>
-        <w:rPr>
-          <w:rFonts w:ascii="Times New Roman" w:hAnsi="Times New Roman" w:cs="Times New Roman"/>
-          <w:iCs/>
-          <w:kern w:val="0"/>
-          <w:sz w:val="24"/>
-          <w:szCs w:val="24"/>
-          <w14:ligatures w14:val="none"/>
-        </w:rPr>
-        <w:t xml:space="preserve"> void</w:t>
-      </w:r>
-      <w:r>
-        <w:rPr>
-          <w:rFonts w:ascii="Times New Roman" w:hAnsi="Times New Roman" w:cs="Times New Roman"/>
-          <w:iCs/>
-          <w:kern w:val="0"/>
-          <w:sz w:val="24"/>
-          <w:szCs w:val="24"/>
-          <w14:ligatures w14:val="none"/>
-        </w:rPr>
-        <w:t xml:space="preserve">, and undoubtedly a liberal doctrine </w:t>
-      </w:r>
-      <w:r>
-        <w:rPr>
-          <w:rFonts w:ascii="Times New Roman" w:hAnsi="Times New Roman" w:cs="Times New Roman"/>
-          <w:iCs/>
-          <w:kern w:val="0"/>
-          <w:sz w:val="24"/>
-          <w:szCs w:val="24"/>
-          <w14:ligatures w14:val="none"/>
-        </w:rPr>
-        <w:t xml:space="preserve">of statehood </w:t>
-      </w:r>
-      <w:r>
-        <w:rPr>
-          <w:rFonts w:ascii="Times New Roman" w:hAnsi="Times New Roman" w:cs="Times New Roman"/>
-          <w:iCs/>
-          <w:kern w:val="0"/>
-          <w:sz w:val="24"/>
-          <w:szCs w:val="24"/>
-          <w14:ligatures w14:val="none"/>
-        </w:rPr>
-        <w:t xml:space="preserve">deriving from the Enlightenment </w:t>
-      </w:r>
-      <w:r>
-        <w:rPr>
-          <w:rFonts w:ascii="Times New Roman" w:hAnsi="Times New Roman" w:cs="Times New Roman"/>
-          <w:iCs/>
-          <w:kern w:val="0"/>
-          <w:sz w:val="24"/>
-          <w:szCs w:val="24"/>
-          <w14:ligatures w14:val="none"/>
-        </w:rPr>
-        <w:t xml:space="preserve">may </w:t>
-      </w:r>
-      <w:r>
-        <w:rPr>
-          <w:rFonts w:ascii="Times New Roman" w:hAnsi="Times New Roman" w:cs="Times New Roman"/>
-          <w:iCs/>
-          <w:kern w:val="0"/>
-          <w:sz w:val="24"/>
-          <w:szCs w:val="24"/>
-          <w14:ligatures w14:val="none"/>
-        </w:rPr>
-        <w:t>contribute to this feeling</w:t>
-      </w:r>
-      <w:r>
-        <w:rPr>
-          <w:rFonts w:ascii="Times New Roman" w:hAnsi="Times New Roman" w:cs="Times New Roman"/>
-          <w:iCs/>
-          <w:kern w:val="0"/>
-          <w:sz w:val="24"/>
-          <w:szCs w:val="24"/>
-          <w14:ligatures w14:val="none"/>
-        </w:rPr>
-        <w:t>. B</w:t>
-      </w:r>
-      <w:r>
-        <w:rPr>
-          <w:rFonts w:ascii="Times New Roman" w:hAnsi="Times New Roman" w:cs="Times New Roman"/>
-          <w:iCs/>
-          <w:kern w:val="0"/>
-          <w:sz w:val="24"/>
-          <w:szCs w:val="24"/>
-          <w14:ligatures w14:val="none"/>
-        </w:rPr>
-        <w:t xml:space="preserve">ut a people </w:t>
-      </w:r>
-      <w:r>
-        <w:rPr>
-          <w:rFonts w:ascii="Times New Roman" w:hAnsi="Times New Roman" w:cs="Times New Roman"/>
-          <w:iCs/>
-          <w:kern w:val="0"/>
-          <w:sz w:val="24"/>
-          <w:szCs w:val="24"/>
-          <w14:ligatures w14:val="none"/>
-        </w:rPr>
-        <w:t>who</w:t>
-      </w:r>
-      <w:r>
-        <w:rPr>
-          <w:rFonts w:ascii="Times New Roman" w:hAnsi="Times New Roman" w:cs="Times New Roman"/>
-          <w:iCs/>
-          <w:kern w:val="0"/>
-          <w:sz w:val="24"/>
-          <w:szCs w:val="24"/>
-          <w14:ligatures w14:val="none"/>
-        </w:rPr>
-        <w:t xml:space="preserve"> practically implement and legi</w:t>
-      </w:r>
-      <w:r>
-        <w:rPr>
-          <w:rFonts w:ascii="Times New Roman" w:hAnsi="Times New Roman" w:cs="Times New Roman"/>
-          <w:iCs/>
-          <w:kern w:val="0"/>
-          <w:sz w:val="24"/>
-          <w:szCs w:val="24"/>
-          <w14:ligatures w14:val="none"/>
-        </w:rPr>
-        <w:t>slate</w:t>
-      </w:r>
-      <w:r>
-        <w:rPr>
-          <w:rFonts w:ascii="Times New Roman" w:hAnsi="Times New Roman" w:cs="Times New Roman"/>
-          <w:iCs/>
-          <w:kern w:val="0"/>
-          <w:sz w:val="24"/>
-          <w:szCs w:val="24"/>
-          <w14:ligatures w14:val="none"/>
-        </w:rPr>
-        <w:t xml:space="preserve"> a spiritual renewal</w:t>
-      </w:r>
-      <w:r>
-        <w:rPr>
-          <w:rFonts w:ascii="Times New Roman" w:hAnsi="Times New Roman" w:cs="Times New Roman"/>
-          <w:iCs/>
-          <w:kern w:val="0"/>
-          <w:sz w:val="24"/>
-          <w:szCs w:val="24"/>
-          <w14:ligatures w14:val="none"/>
-        </w:rPr>
-        <w:t xml:space="preserve"> </w:t>
-      </w:r>
-      <w:r>
-        <w:rPr>
-          <w:rFonts w:ascii="Times New Roman" w:hAnsi="Times New Roman" w:cs="Times New Roman"/>
-          <w:iCs/>
-          <w:kern w:val="0"/>
-          <w:sz w:val="24"/>
-          <w:szCs w:val="24"/>
-          <w14:ligatures w14:val="none"/>
-        </w:rPr>
-        <w:t>in the name of</w:t>
-      </w:r>
-      <w:r>
-        <w:rPr>
-          <w:rFonts w:ascii="Times New Roman" w:hAnsi="Times New Roman" w:cs="Times New Roman"/>
-          <w:iCs/>
-          <w:kern w:val="0"/>
-          <w:sz w:val="24"/>
-          <w:szCs w:val="24"/>
-          <w14:ligatures w14:val="none"/>
-        </w:rPr>
-        <w:t xml:space="preserve"> Being will</w:t>
-      </w:r>
-      <w:r>
-        <w:rPr>
-          <w:rFonts w:ascii="Times New Roman" w:hAnsi="Times New Roman" w:cs="Times New Roman"/>
-          <w:iCs/>
-          <w:kern w:val="0"/>
-          <w:sz w:val="24"/>
-          <w:szCs w:val="24"/>
-          <w14:ligatures w14:val="none"/>
-        </w:rPr>
-        <w:t xml:space="preserve"> not find the grass </w:t>
-      </w:r>
-      <w:r>
-        <w:rPr>
-          <w:rFonts w:ascii="Times New Roman" w:hAnsi="Times New Roman" w:cs="Times New Roman"/>
-          <w:iCs/>
-          <w:kern w:val="0"/>
-          <w:sz w:val="24"/>
-          <w:szCs w:val="24"/>
-          <w14:ligatures w14:val="none"/>
-        </w:rPr>
-        <w:t>is</w:t>
-      </w:r>
-      <w:r>
-        <w:rPr>
-          <w:rFonts w:ascii="Times New Roman" w:hAnsi="Times New Roman" w:cs="Times New Roman"/>
-          <w:iCs/>
-          <w:kern w:val="0"/>
-          <w:sz w:val="24"/>
-          <w:szCs w:val="24"/>
-          <w14:ligatures w14:val="none"/>
-        </w:rPr>
         <w:t xml:space="preserve"> greener. </w:t>
       </w:r>
-    </w:p>
-    <w:p>
-      <w:pPr>
-        <w:spacing w:line="480" w:lineRule="auto"/>
-        <w:contextualSpacing/>
-        <w:rPr>
-          <w:rFonts w:ascii="Times New Roman" w:hAnsi="Times New Roman" w:cs="Times New Roman"/>
-          <w:kern w:val="0"/>
-          <w:sz w:val="24"/>
-          <w:szCs w:val="24"/>
-          <w14:ligatures w14:val="none"/>
-        </w:rPr>
-      </w:pPr>
     </w:p>
     <w:sectPr>
       <w:footerReference w:type="default" r:id="rId7"/>
@@ -16828,29 +16431,7 @@
           <w:sz w:val="22"/>
           <w:szCs w:val="22"/>
         </w:rPr>
-        <w:t xml:space="preserve">Heidegger: The Introduction of Nazism into Philosophy </w:t>
-      </w:r>
-      <w:proofErr w:type="gramStart"/>
-      <w:r>
-        <w:rPr>
-          <w:rFonts w:ascii="Times New Roman" w:hAnsi="Times New Roman" w:cs="Times New Roman"/>
-          <w:i/>
-          <w:iCs/>
-          <w:sz w:val="22"/>
-          <w:szCs w:val="22"/>
-        </w:rPr>
-        <w:t>in Light of</w:t>
-      </w:r>
-      <w:proofErr w:type="gramEnd"/>
-      <w:r>
-        <w:rPr>
-          <w:rFonts w:ascii="Times New Roman" w:hAnsi="Times New Roman" w:cs="Times New Roman"/>
-          <w:i/>
-          <w:iCs/>
-          <w:sz w:val="22"/>
-          <w:szCs w:val="22"/>
-        </w:rPr>
-        <w:t xml:space="preserve"> the Unpublished Seminars of 1933-1935</w:t>
+        <w:t>Heidegger: The Introduction of Nazism into Philosophy in Light of the Unpublished Seminars of 1933-1935</w:t>
       </w:r>
       <w:r>
         <w:rPr>
@@ -17689,23 +17270,41 @@
           <w:sz w:val="22"/>
           <w:szCs w:val="22"/>
         </w:rPr>
-        <w:t xml:space="preserve">Discourse on the Origin of Inequality </w:t>
-      </w:r>
-      <w:r>
-        <w:rPr>
-          <w:rFonts w:ascii="Times New Roman" w:hAnsi="Times New Roman" w:cs="Times New Roman"/>
-          <w:sz w:val="22"/>
-          <w:szCs w:val="22"/>
-        </w:rPr>
-        <w:t xml:space="preserve">(Indianapolis: Hackett Publishing, </w:t>
-      </w:r>
-      <w:r>
-        <w:rPr>
-          <w:rFonts w:ascii="Times New Roman" w:hAnsi="Times New Roman" w:cs="Times New Roman"/>
-          <w:sz w:val="22"/>
-          <w:szCs w:val="22"/>
-        </w:rPr>
-        <w:t xml:space="preserve">1992). </w:t>
+        <w:t>On the Social Contract</w:t>
+      </w:r>
+      <w:r>
+        <w:rPr>
+          <w:rFonts w:ascii="Times New Roman" w:hAnsi="Times New Roman" w:cs="Times New Roman"/>
+          <w:i/>
+          <w:iCs/>
+          <w:sz w:val="22"/>
+          <w:szCs w:val="22"/>
+        </w:rPr>
+        <w:t xml:space="preserve"> </w:t>
+      </w:r>
+      <w:r>
+        <w:rPr>
+          <w:rFonts w:ascii="Times New Roman" w:hAnsi="Times New Roman" w:cs="Times New Roman"/>
+          <w:sz w:val="22"/>
+          <w:szCs w:val="22"/>
+        </w:rPr>
+        <w:t>(Indianapolis: Hackett Publishing,</w:t>
+      </w:r>
+      <w:r>
+        <w:rPr>
+          <w:rFonts w:ascii="Times New Roman" w:hAnsi="Times New Roman" w:cs="Times New Roman"/>
+          <w:sz w:val="22"/>
+          <w:szCs w:val="22"/>
+        </w:rPr>
+        <w:t xml:space="preserve"> 1987</w:t>
+      </w:r>
+      <w:r>
+        <w:rPr>
+          <w:rFonts w:ascii="Times New Roman" w:hAnsi="Times New Roman" w:cs="Times New Roman"/>
+          <w:sz w:val="22"/>
+          <w:szCs w:val="22"/>
+        </w:rPr>
+        <w:t xml:space="preserve">). </w:t>
       </w:r>
       <w:r>
         <w:rPr>

</xml_diff>